<commit_message>
Expand resumes to fill full page (auto-fit sizing), ATS-safe
</commit_message>
<xml_diff>
--- a/Job hunt/Amit Kumar Mohanty - HCLTech AI Developer I.docx
+++ b/Job hunt/Amit Kumar Mohanty - HCLTech AI Developer I.docx
@@ -4,20 +4,20 @@
   <w:body>
     <w:p>
       <w:pPr>
-        <w:spacing w:before="0" w:after="20" w:line="240" w:lineRule="auto"/>
+        <w:spacing w:before="0" w:after="40" w:line="240" w:lineRule="auto"/>
         <w:jc w:val="center"/>
       </w:pPr>
       <w:r>
         <w:rPr>
           <w:b/>
-          <w:sz w:val="40"/>
+          <w:sz w:val="39"/>
         </w:rPr>
         <w:t>Amit Kumar Mohanty</w:t>
       </w:r>
     </w:p>
     <w:p>
       <w:pPr>
-        <w:spacing w:before="0" w:after="20" w:line="240" w:lineRule="auto"/>
+        <w:spacing w:before="0" w:after="40" w:line="240" w:lineRule="auto"/>
         <w:jc w:val="center"/>
       </w:pPr>
       <w:r>
@@ -29,7 +29,7 @@
     </w:p>
     <w:p>
       <w:pPr>
-        <w:spacing w:before="0" w:after="80" w:line="240" w:lineRule="auto"/>
+        <w:spacing w:before="0" w:after="100" w:line="240" w:lineRule="auto"/>
         <w:jc w:val="center"/>
       </w:pPr>
       <w:r>
@@ -42,7 +42,7 @@
     </w:p>
     <w:p>
       <w:pPr>
-        <w:spacing w:before="100" w:after="20" w:line="240" w:lineRule="auto"/>
+        <w:spacing w:before="120" w:after="40" w:line="240" w:lineRule="auto"/>
         <w:pBdr>
           <w:bottom w:val="single" w:sz="6" w:space="1" w:color="1F3A5F"/>
         </w:pBdr>
@@ -51,7 +51,7 @@
         <w:rPr>
           <w:b/>
           <w:color w:val="1F3A5F"/>
-          <w:sz w:val="22"/>
+          <w:sz w:val="20"/>
         </w:rPr>
         <w:t>PROFESSIONAL SUMMARY</w:t>
       </w:r>
@@ -69,7 +69,7 @@
     </w:p>
     <w:p>
       <w:pPr>
-        <w:spacing w:before="100" w:after="20" w:line="240" w:lineRule="auto"/>
+        <w:spacing w:before="120" w:after="40" w:line="240" w:lineRule="auto"/>
         <w:pBdr>
           <w:bottom w:val="single" w:sz="6" w:space="1" w:color="1F3A5F"/>
         </w:pBdr>
@@ -78,7 +78,7 @@
         <w:rPr>
           <w:b/>
           <w:color w:val="1F3A5F"/>
-          <w:sz w:val="22"/>
+          <w:sz w:val="20"/>
         </w:rPr>
         <w:t>EDUCATION</w:t>
       </w:r>
@@ -88,19 +88,19 @@
         <w:tabs>
           <w:tab w:pos="10512" w:val="right"/>
         </w:tabs>
-        <w:spacing w:before="40" w:after="0" w:line="240" w:lineRule="auto"/>
+        <w:spacing w:before="60" w:after="0" w:line="240" w:lineRule="auto"/>
       </w:pPr>
       <w:r>
         <w:rPr>
           <w:b/>
-          <w:sz w:val="20"/>
+          <w:sz w:val="18"/>
         </w:rPr>
         <w:t>Birla Institute of Technology and Science, Pilani (BITS Pilani)</w:t>
       </w:r>
       <w:r>
         <w:rPr>
           <w:b/>
-          <w:sz w:val="18"/>
+          <w:sz w:val="16"/>
         </w:rPr>
         <w:tab/>
         <w:t>July 2026 - July 2028</w:t>
@@ -123,19 +123,19 @@
         <w:tabs>
           <w:tab w:pos="10512" w:val="right"/>
         </w:tabs>
-        <w:spacing w:before="40" w:after="0" w:line="240" w:lineRule="auto"/>
+        <w:spacing w:before="60" w:after="0" w:line="240" w:lineRule="auto"/>
       </w:pPr>
       <w:r>
         <w:rPr>
           <w:b/>
-          <w:sz w:val="20"/>
+          <w:sz w:val="18"/>
         </w:rPr>
         <w:t>K.R. Mangalam University, Gurgaon</w:t>
       </w:r>
       <w:r>
         <w:rPr>
           <w:b/>
-          <w:sz w:val="18"/>
+          <w:sz w:val="16"/>
         </w:rPr>
         <w:tab/>
         <w:t>July 2021 - July 2025</w:t>
@@ -155,7 +155,7 @@
     </w:p>
     <w:p>
       <w:pPr>
-        <w:spacing w:before="100" w:after="20" w:line="240" w:lineRule="auto"/>
+        <w:spacing w:before="120" w:after="40" w:line="240" w:lineRule="auto"/>
         <w:pBdr>
           <w:bottom w:val="single" w:sz="6" w:space="1" w:color="1F3A5F"/>
         </w:pBdr>
@@ -164,7 +164,7 @@
         <w:rPr>
           <w:b/>
           <w:color w:val="1F3A5F"/>
-          <w:sz w:val="22"/>
+          <w:sz w:val="20"/>
         </w:rPr>
         <w:t>EXPERIENCE</w:t>
       </w:r>
@@ -174,19 +174,19 @@
         <w:tabs>
           <w:tab w:pos="10512" w:val="right"/>
         </w:tabs>
-        <w:spacing w:before="40" w:after="0" w:line="240" w:lineRule="auto"/>
+        <w:spacing w:before="60" w:after="0" w:line="240" w:lineRule="auto"/>
       </w:pPr>
       <w:r>
         <w:rPr>
           <w:b/>
-          <w:sz w:val="20"/>
+          <w:sz w:val="18"/>
         </w:rPr>
         <w:t>Research Associate - AI, Keywords Studios India  -  Gurgaon, Haryana</w:t>
       </w:r>
       <w:r>
         <w:rPr>
           <w:b/>
-          <w:sz w:val="18"/>
+          <w:sz w:val="16"/>
         </w:rPr>
         <w:tab/>
         <w:t>May 2025 - Present</w:t>
@@ -195,7 +195,7 @@
     <w:p>
       <w:pPr>
         <w:pStyle w:val="ListBullet"/>
-        <w:spacing w:after="0" w:before="0" w:line="240" w:lineRule="auto"/>
+        <w:spacing w:after="22" w:before="0" w:line="240" w:lineRule="auto"/>
         <w:ind w:left="259"/>
       </w:pPr>
       <w:r>
@@ -208,7 +208,7 @@
     <w:p>
       <w:pPr>
         <w:pStyle w:val="ListBullet"/>
-        <w:spacing w:after="0" w:before="0" w:line="240" w:lineRule="auto"/>
+        <w:spacing w:after="22" w:before="0" w:line="240" w:lineRule="auto"/>
         <w:ind w:left="259"/>
       </w:pPr>
       <w:r>
@@ -221,7 +221,7 @@
     <w:p>
       <w:pPr>
         <w:pStyle w:val="ListBullet"/>
-        <w:spacing w:after="0" w:before="0" w:line="240" w:lineRule="auto"/>
+        <w:spacing w:after="22" w:before="0" w:line="240" w:lineRule="auto"/>
         <w:ind w:left="259"/>
       </w:pPr>
       <w:r>
@@ -234,7 +234,7 @@
     <w:p>
       <w:pPr>
         <w:pStyle w:val="ListBullet"/>
-        <w:spacing w:after="0" w:before="0" w:line="240" w:lineRule="auto"/>
+        <w:spacing w:after="22" w:before="0" w:line="240" w:lineRule="auto"/>
         <w:ind w:left="259"/>
       </w:pPr>
       <w:r>
@@ -246,22 +246,32 @@
     </w:p>
     <w:p>
       <w:pPr>
+        <w:spacing w:before="0" w:after="0" w:line="240" w:lineRule="auto"/>
+      </w:pPr>
+      <w:r>
+        <w:rPr>
+          <w:sz w:val="5"/>
+        </w:rPr>
+      </w:r>
+    </w:p>
+    <w:p>
+      <w:pPr>
         <w:tabs>
           <w:tab w:pos="10512" w:val="right"/>
         </w:tabs>
-        <w:spacing w:before="40" w:after="0" w:line="240" w:lineRule="auto"/>
+        <w:spacing w:before="60" w:after="0" w:line="240" w:lineRule="auto"/>
       </w:pPr>
       <w:r>
         <w:rPr>
           <w:b/>
-          <w:sz w:val="20"/>
+          <w:sz w:val="18"/>
         </w:rPr>
         <w:t>Artificial Intelligence Intern, Infosys  -  Remote</w:t>
       </w:r>
       <w:r>
         <w:rPr>
           <w:b/>
-          <w:sz w:val="18"/>
+          <w:sz w:val="16"/>
         </w:rPr>
         <w:tab/>
         <w:t>Nov 2024 - Feb 2025</w:t>
@@ -270,7 +280,7 @@
     <w:p>
       <w:pPr>
         <w:pStyle w:val="ListBullet"/>
-        <w:spacing w:after="0" w:before="0" w:line="240" w:lineRule="auto"/>
+        <w:spacing w:after="22" w:before="0" w:line="240" w:lineRule="auto"/>
         <w:ind w:left="259"/>
       </w:pPr>
       <w:r>
@@ -283,7 +293,7 @@
     <w:p>
       <w:pPr>
         <w:pStyle w:val="ListBullet"/>
-        <w:spacing w:after="0" w:before="0" w:line="240" w:lineRule="auto"/>
+        <w:spacing w:after="22" w:before="0" w:line="240" w:lineRule="auto"/>
         <w:ind w:left="259"/>
       </w:pPr>
       <w:r>
@@ -296,7 +306,7 @@
     <w:p>
       <w:pPr>
         <w:pStyle w:val="ListBullet"/>
-        <w:spacing w:after="0" w:before="0" w:line="240" w:lineRule="auto"/>
+        <w:spacing w:after="22" w:before="0" w:line="240" w:lineRule="auto"/>
         <w:ind w:left="259"/>
       </w:pPr>
       <w:r>
@@ -308,7 +318,17 @@
     </w:p>
     <w:p>
       <w:pPr>
-        <w:spacing w:before="100" w:after="20" w:line="240" w:lineRule="auto"/>
+        <w:spacing w:before="0" w:after="0" w:line="240" w:lineRule="auto"/>
+      </w:pPr>
+      <w:r>
+        <w:rPr>
+          <w:sz w:val="5"/>
+        </w:rPr>
+      </w:r>
+    </w:p>
+    <w:p>
+      <w:pPr>
+        <w:spacing w:before="120" w:after="40" w:line="240" w:lineRule="auto"/>
         <w:pBdr>
           <w:bottom w:val="single" w:sz="6" w:space="1" w:color="1F3A5F"/>
         </w:pBdr>
@@ -317,7 +337,7 @@
         <w:rPr>
           <w:b/>
           <w:color w:val="1F3A5F"/>
-          <w:sz w:val="22"/>
+          <w:sz w:val="20"/>
         </w:rPr>
         <w:t>PROJECTS</w:t>
       </w:r>
@@ -327,19 +347,19 @@
         <w:tabs>
           <w:tab w:pos="10512" w:val="right"/>
         </w:tabs>
-        <w:spacing w:before="40" w:after="0" w:line="240" w:lineRule="auto"/>
+        <w:spacing w:before="60" w:after="0" w:line="240" w:lineRule="auto"/>
       </w:pPr>
       <w:r>
         <w:rPr>
           <w:b/>
-          <w:sz w:val="20"/>
+          <w:sz w:val="18"/>
         </w:rPr>
         <w:t>Dynamic Screen Companion</w:t>
       </w:r>
       <w:r>
         <w:rPr>
           <w:b/>
-          <w:sz w:val="18"/>
+          <w:sz w:val="16"/>
         </w:rPr>
         <w:tab/>
         <w:t>June 2025 - Present</w:t>
@@ -348,7 +368,7 @@
     <w:p>
       <w:pPr>
         <w:pStyle w:val="ListBullet"/>
-        <w:spacing w:after="0" w:before="0" w:line="240" w:lineRule="auto"/>
+        <w:spacing w:after="22" w:before="0" w:line="240" w:lineRule="auto"/>
         <w:ind w:left="259"/>
       </w:pPr>
       <w:r>
@@ -361,7 +381,7 @@
     <w:p>
       <w:pPr>
         <w:pStyle w:val="ListBullet"/>
-        <w:spacing w:after="0" w:before="0" w:line="240" w:lineRule="auto"/>
+        <w:spacing w:after="22" w:before="0" w:line="240" w:lineRule="auto"/>
         <w:ind w:left="259"/>
       </w:pPr>
       <w:r>
@@ -374,7 +394,7 @@
     <w:p>
       <w:pPr>
         <w:pStyle w:val="ListBullet"/>
-        <w:spacing w:after="0" w:before="0" w:line="240" w:lineRule="auto"/>
+        <w:spacing w:after="22" w:before="0" w:line="240" w:lineRule="auto"/>
         <w:ind w:left="259"/>
       </w:pPr>
       <w:r>
@@ -386,22 +406,32 @@
     </w:p>
     <w:p>
       <w:pPr>
+        <w:spacing w:before="0" w:after="0" w:line="240" w:lineRule="auto"/>
+      </w:pPr>
+      <w:r>
+        <w:rPr>
+          <w:sz w:val="5"/>
+        </w:rPr>
+      </w:r>
+    </w:p>
+    <w:p>
+      <w:pPr>
         <w:tabs>
           <w:tab w:pos="10512" w:val="right"/>
         </w:tabs>
-        <w:spacing w:before="40" w:after="0" w:line="240" w:lineRule="auto"/>
+        <w:spacing w:before="60" w:after="0" w:line="240" w:lineRule="auto"/>
       </w:pPr>
       <w:r>
         <w:rPr>
           <w:b/>
-          <w:sz w:val="20"/>
+          <w:sz w:val="18"/>
         </w:rPr>
         <w:t>Diabetic Optiscan (Peer-reviewed research)</w:t>
       </w:r>
       <w:r>
         <w:rPr>
           <w:b/>
-          <w:sz w:val="18"/>
+          <w:sz w:val="16"/>
         </w:rPr>
         <w:tab/>
         <w:t>Jan 2025 - June 2025</w:t>
@@ -410,7 +440,7 @@
     <w:p>
       <w:pPr>
         <w:pStyle w:val="ListBullet"/>
-        <w:spacing w:after="0" w:before="0" w:line="240" w:lineRule="auto"/>
+        <w:spacing w:after="22" w:before="0" w:line="240" w:lineRule="auto"/>
         <w:ind w:left="259"/>
       </w:pPr>
       <w:r>
@@ -423,7 +453,7 @@
     <w:p>
       <w:pPr>
         <w:pStyle w:val="ListBullet"/>
-        <w:spacing w:after="0" w:before="0" w:line="240" w:lineRule="auto"/>
+        <w:spacing w:after="22" w:before="0" w:line="240" w:lineRule="auto"/>
         <w:ind w:left="259"/>
       </w:pPr>
       <w:r>
@@ -436,7 +466,7 @@
     <w:p>
       <w:pPr>
         <w:pStyle w:val="ListBullet"/>
-        <w:spacing w:after="0" w:before="0" w:line="240" w:lineRule="auto"/>
+        <w:spacing w:after="22" w:before="0" w:line="240" w:lineRule="auto"/>
         <w:ind w:left="259"/>
       </w:pPr>
       <w:r>
@@ -448,7 +478,17 @@
     </w:p>
     <w:p>
       <w:pPr>
-        <w:spacing w:before="100" w:after="20" w:line="240" w:lineRule="auto"/>
+        <w:spacing w:before="0" w:after="0" w:line="240" w:lineRule="auto"/>
+      </w:pPr>
+      <w:r>
+        <w:rPr>
+          <w:sz w:val="5"/>
+        </w:rPr>
+      </w:r>
+    </w:p>
+    <w:p>
+      <w:pPr>
+        <w:spacing w:before="120" w:after="40" w:line="240" w:lineRule="auto"/>
         <w:pBdr>
           <w:bottom w:val="single" w:sz="6" w:space="1" w:color="1F3A5F"/>
         </w:pBdr>
@@ -457,7 +497,7 @@
         <w:rPr>
           <w:b/>
           <w:color w:val="1F3A5F"/>
-          <w:sz w:val="22"/>
+          <w:sz w:val="20"/>
         </w:rPr>
         <w:t>SKILLS</w:t>
       </w:r>
@@ -554,7 +594,7 @@
     </w:p>
     <w:p>
       <w:pPr>
-        <w:spacing w:before="100" w:after="20" w:line="240" w:lineRule="auto"/>
+        <w:spacing w:before="120" w:after="40" w:line="240" w:lineRule="auto"/>
         <w:pBdr>
           <w:bottom w:val="single" w:sz="6" w:space="1" w:color="1F3A5F"/>
         </w:pBdr>
@@ -563,7 +603,7 @@
         <w:rPr>
           <w:b/>
           <w:color w:val="1F3A5F"/>
-          <w:sz w:val="22"/>
+          <w:sz w:val="20"/>
         </w:rPr>
         <w:t>CERTIFICATIONS</w:t>
       </w:r>
@@ -571,7 +611,7 @@
     <w:p>
       <w:pPr>
         <w:pStyle w:val="ListBullet"/>
-        <w:spacing w:after="0" w:before="0" w:line="240" w:lineRule="auto"/>
+        <w:spacing w:after="22" w:before="0" w:line="240" w:lineRule="auto"/>
         <w:ind w:left="259"/>
       </w:pPr>
       <w:r>
@@ -584,7 +624,7 @@
     <w:p>
       <w:pPr>
         <w:pStyle w:val="ListBullet"/>
-        <w:spacing w:after="0" w:before="0" w:line="240" w:lineRule="auto"/>
+        <w:spacing w:after="22" w:before="0" w:line="240" w:lineRule="auto"/>
         <w:ind w:left="259"/>
       </w:pPr>
       <w:r>
@@ -597,7 +637,7 @@
     <w:p>
       <w:pPr>
         <w:pStyle w:val="ListBullet"/>
-        <w:spacing w:after="0" w:before="0" w:line="240" w:lineRule="auto"/>
+        <w:spacing w:after="22" w:before="0" w:line="240" w:lineRule="auto"/>
         <w:ind w:left="259"/>
       </w:pPr>
       <w:r>
@@ -609,7 +649,7 @@
     </w:p>
     <w:sectPr>
       <w:pgSz w:w="12240" w:h="15840"/>
-      <w:pgMar w:top="576" w:right="864" w:bottom="576" w:left="864" w:header="720" w:footer="720" w:gutter="0"/>
+      <w:pgMar w:top="720" w:right="864" w:bottom="720" w:left="864" w:header="720" w:footer="720" w:gutter="0"/>
       <w:cols w:space="720"/>
       <w:docGrid w:linePitch="360"/>
     </w:sectPr>

</xml_diff>